<commit_message>
docs(p1): actualiza evidencia reproducible y resultados del experimento
</commit_message>
<xml_diff>
--- a/references/TC5061_Propuesta_Proyecto_Equipo49.docx
+++ b/references/TC5061_Propuesta_Proyecto_Equipo49.docx
@@ -1269,7 +1269,7 @@
           <w:b w:val="0"/>
           <w:rtl w:val="0"/>
         </w:rPr>
-        <w:t>La actualización incorpora la ingesta reproducible, las variables y dos baselines de P1 ejecutados desde el código, con 4,493,328 viajes limpios y trazabilidad en MLflow local. La media de cuatro semanas se eligió por validación y obtuvo MAE de prueba de 0.8806 viajes por estación-hora. Se conservan la propuesta de P2 y la implementación exploratoria de P3 documentada por el equipo. P2, la integración conjunta y la evidencia individual de colaboración continúan pendientes. Los cambios de P1 permanecen locales en la rama Saul, sin commit ni push.</w:t>
+        <w:t>La actualización incorpora la ingesta reproducible, las variables y dos baselines de P1 ejecutados desde el código, con 4,493,328 viajes limpios y trazabilidad en MLflow local. La media de cuatro semanas se eligió por validación y obtuvo MAE de prueba de 0.8806 viajes por estación-hora. Se conservan la propuesta de P2 y la implementación exploratoria de P3 documentada por el equipo. P2, la integración conjunta y la evidencia individual de colaboración continúan pendientes. La contribución de P1 se presenta mediante Pull Request desde la rama Saul y requiere revisión del equipo antes de fusionarse a main.</w:t>
       </w:r>
     </w:p>
     <w:p>
@@ -16334,7 +16334,7 @@
       <w:r>
         <w:drawing>
           <wp:inline>
-            <wp:extent cx="6080760" cy="2487584"/>
+            <wp:extent cx="5486400" cy="2244436"/>
             <wp:docPr id="13" name="Picture 13" descr="Figura P1.2. Totales diarios de la cohorte de prueba. La suma de la red puede cancelar errores de estaciones distintas y debe leerse junto al MAE estación-hora."/>
             <wp:cNvGraphicFramePr>
               <a:graphicFrameLocks noChangeAspect="1"/>
@@ -16355,7 +16355,7 @@
                   <pic:spPr>
                     <a:xfrm>
                       <a:off x="0" y="0"/>
-                      <a:ext cx="6080760" cy="2487584"/>
+                      <a:ext cx="5486400" cy="2244436"/>
                     </a:xfrm>
                     <a:prstGeom prst="rect"/>
                   </pic:spPr>
@@ -16552,7 +16552,7 @@
                 <w:color w:val="000000"/>
                 <w:sz w:val="19"/>
               </w:rPr>
-              <w:t>73a1012f12e64d748ab5a6cac260d626</w:t>
+              <w:t>afb77ec9c5904efd9e9c059376d7b90b</w:t>
             </w:r>
           </w:p>
         </w:tc>
@@ -16613,7 +16613,7 @@
                 <w:color w:val="000000"/>
                 <w:sz w:val="19"/>
               </w:rPr>
-              <w:t>8bf2392b699e4604b9be6807f1f23f51</w:t>
+              <w:t>15d5969c45f54aadb44b80b8f0aa8563</w:t>
             </w:r>
           </w:p>
         </w:tc>
@@ -16677,7 +16677,7 @@
           <w:color w:val="000000"/>
           <w:sz w:val="17"/>
         </w:rPr>
-        <w:t>source_version: e73f2a62f7092f01c0c25ac2c3619e2a4fad5ab1ee79b6965f059d6ed6dcc78f</w:t>
+        <w:t>source_version: 25f9a8265b0c28941d6e83bb92c45a5c2a15ccf69c0cf21f4fc9e01c12da5c7c</w:t>
       </w:r>
     </w:p>
     <w:p>
@@ -16692,7 +16692,7 @@
           <w:color w:val="000000"/>
           <w:sz w:val="21"/>
         </w:rPr>
-        <w:t>Commit base: fee97032554eec71b9b4783373390c1f5517cf0c; git_dirty=true. Los cambios siguen locales en Saul. reproducibility/code_snapshot.zip conserva módulos, pyproject.toml y lock ejecutados; code_provenance.json fija sus hashes. La evaluación verifica meses y hashes contra el manifiesto.</w:t>
+        <w:t>Commit de ejecución: 52af95c13416705906f0630f058a4c78645a2fbe; git_dirty=false. El commit contiene la implementación de P1. reproducibility/code_snapshot.zip conserva módulos, pyproject.toml, lock, README y licencia; code_provenance.json fija hashes de código y contexto por separado. La evaluación verifica meses y hashes contra el manifiesto.</w:t>
       </w:r>
     </w:p>
     <w:p>
@@ -16707,7 +16707,7 @@
           <w:color w:val="000000"/>
           <w:sz w:val="21"/>
         </w:rPr>
-        <w:t>Cada run registra 22 parámetros, incluyendo fechas, versión de datos y código, semilla 42, horizonte de 24 horas y rezagos; 14 métricas con prefijos val_ y test_; etiquetas de equipo, pregunta y Git; manifiesto, calidad, métricas por estación, gráficas y código. Los datos individuales y carpetas de MLflow siguen fuera de Git.</w:t>
+        <w:t>Cada run registra 22 parámetros de reproducción, 14 métricas val_* y test_*, etiquetas de equipo, pregunta y Git, además de manifiesto, calidad, tablas, gráficas y código. Los datos individuales y carpetas de MLflow siguen fuera de Git.</w:t>
       </w:r>
     </w:p>
     <w:p>
@@ -16737,7 +16737,7 @@
       <w:r>
         <w:drawing>
           <wp:inline>
-            <wp:extent cx="5349240" cy="6681179"/>
+            <wp:extent cx="5349240" cy="5060422"/>
             <wp:docPr id="14" name="Picture 14" descr="Figura P1.3. Lista de los dos runs P1 del experimento mibici-equipo49 en la interfaz local de MLflow."/>
             <wp:cNvGraphicFramePr>
               <a:graphicFrameLocks noChangeAspect="1"/>
@@ -16758,7 +16758,7 @@
                   <pic:spPr>
                     <a:xfrm>
                       <a:off x="0" y="0"/>
-                      <a:ext cx="5349240" cy="6681179"/>
+                      <a:ext cx="5349240" cy="5060422"/>
                     </a:xfrm>
                     <a:prstGeom prst="rect"/>
                   </pic:spPr>
@@ -16811,8 +16811,8 @@
       <w:r>
         <w:drawing>
           <wp:inline>
-            <wp:extent cx="5349240" cy="6681179"/>
-            <wp:docPr id="15" name="Picture 15" descr="Figura P1.4. Identificación, estado y etiquetas de P1-media-4semanas. Se declara el commit base y git_dirty=true."/>
+            <wp:extent cx="5349240" cy="5060422"/>
+            <wp:docPr id="15" name="Picture 15" descr="Figura P1.4. Identificación, estado y etiquetas de P1-media-4semanas. El commit contiene P1 y se declara git_dirty=false."/>
             <wp:cNvGraphicFramePr>
               <a:graphicFrameLocks noChangeAspect="1"/>
             </wp:cNvGraphicFramePr>
@@ -16832,7 +16832,7 @@
                   <pic:spPr>
                     <a:xfrm>
                       <a:off x="0" y="0"/>
-                      <a:ext cx="5349240" cy="6681179"/>
+                      <a:ext cx="5349240" cy="5060422"/>
                     </a:xfrm>
                     <a:prstGeom prst="rect"/>
                   </pic:spPr>
@@ -16855,7 +16855,7 @@
           <w:color w:val="000000"/>
           <w:sz w:val="18"/>
         </w:rPr>
-        <w:t>Figura P1.4. Identificación, estado y etiquetas de P1-media-4semanas. Se declara el commit base y git_dirty=true.</w:t>
+        <w:t>Figura P1.4. Identificación, estado y etiquetas de P1-media-4semanas. El commit contiene P1 y se declara git_dirty=false.</w:t>
       </w:r>
     </w:p>
     <w:p>
@@ -16885,7 +16885,7 @@
       <w:r>
         <w:drawing>
           <wp:inline>
-            <wp:extent cx="5349240" cy="6681179"/>
+            <wp:extent cx="5349240" cy="5060422"/>
             <wp:docPr id="16" name="Picture 16" descr="Figura P1.5. Métricas de validación y prueba y parámetros del mismo run, incluyendo data_version, horizonte y rezagos."/>
             <wp:cNvGraphicFramePr>
               <a:graphicFrameLocks noChangeAspect="1"/>
@@ -16906,7 +16906,7 @@
                   <pic:spPr>
                     <a:xfrm>
                       <a:off x="0" y="0"/>
-                      <a:ext cx="5349240" cy="6681179"/>
+                      <a:ext cx="5349240" cy="5060422"/>
                     </a:xfrm>
                     <a:prstGeom prst="rect"/>
                   </pic:spPr>
@@ -16959,7 +16959,7 @@
       <w:r>
         <w:drawing>
           <wp:inline>
-            <wp:extent cx="5349240" cy="6681179"/>
+            <wp:extent cx="5349240" cy="5060422"/>
             <wp:docPr id="17" name="Picture 17" descr="Figura P1.6. Artefacto figures/P1_error_comparison.png visualizado dentro del run de MLflow."/>
             <wp:cNvGraphicFramePr>
               <a:graphicFrameLocks noChangeAspect="1"/>
@@ -16980,7 +16980,7 @@
                   <pic:spPr>
                     <a:xfrm>
                       <a:off x="0" y="0"/>
-                      <a:ext cx="5349240" cy="6681179"/>
+                      <a:ext cx="5349240" cy="5060422"/>
                     </a:xfrm>
                     <a:prstGeom prst="rect"/>
                   </pic:spPr>
@@ -17033,7 +17033,7 @@
       <w:r>
         <w:drawing>
           <wp:inline>
-            <wp:extent cx="5349240" cy="6681179"/>
+            <wp:extent cx="5349240" cy="5060422"/>
             <wp:docPr id="18" name="Picture 18" descr="Figura P1.7. Comparación de los dos runs en MLflow. La media de cuatro semanas mejora MAE, RMSE y WAPE en la misma cohorte."/>
             <wp:cNvGraphicFramePr>
               <a:graphicFrameLocks noChangeAspect="1"/>
@@ -17054,7 +17054,7 @@
                   <pic:spPr>
                     <a:xfrm>
                       <a:off x="0" y="0"/>
-                      <a:ext cx="5349240" cy="6681179"/>
+                      <a:ext cx="5349240" cy="5060422"/>
                     </a:xfrm>
                     <a:prstGeom prst="rect"/>
                   </pic:spPr>
@@ -17100,41 +17100,10 @@
       </w:pPr>
       <w:r>
         <w:rPr>
-          <w:rtl w:val="0"/>
-        </w:rPr>
-        <w:t xml:space="preserve">El diagrama está en </w:t>
-      </w:r>
-      <w:r>
-        <w:rPr>
-          <w:rFonts w:ascii="Consolas" w:cs="Consolas" w:eastAsia="Consolas" w:hAnsi="Consolas"/>
-          <w:color w:val="333333"/>
-          <w:sz w:val="20"/>
-          <w:szCs w:val="20"/>
-          <w:rtl w:val="0"/>
-        </w:rPr>
-        <w:t xml:space="preserve">references/arquitectura_mibici_equipo49.png</w:t>
-      </w:r>
-      <w:r>
-        <w:rPr>
-          <w:rtl w:val="0"/>
-        </w:rPr>
-        <w:t xml:space="preserve"> (fuente en </w:t>
-      </w:r>
-      <w:r>
-        <w:rPr>
-          <w:rFonts w:ascii="Consolas" w:cs="Consolas" w:eastAsia="Consolas" w:hAnsi="Consolas"/>
-          <w:color w:val="333333"/>
-          <w:sz w:val="20"/>
-          <w:szCs w:val="20"/>
-          <w:rtl w:val="0"/>
-        </w:rPr>
-        <w:t xml:space="preserve">03_entregables/diagrama/arquitectura_mibici_equipo49.py</w:t>
-      </w:r>
-      <w:r>
-        <w:rPr>
-          <w:rtl w:val="0"/>
-        </w:rPr>
-        <w:t xml:space="preserve">). Muestra las fuentes, la ingesta, el almacenamiento, el procesamiento, el entrenamiento y el registro de experimentos, junto con el flujo de colaboración.</w:t>
+          <w:b w:val="0"/>
+          <w:rtl w:val="0"/>
+        </w:rPr>
+        <w:t>El diagrama está en references/arquitectura_mibici_equipo49.png. Muestra las fuentes, la ingesta, el almacenamiento, el procesamiento, el entrenamiento y el registro de experimentos, junto con el flujo de colaboración. Representa la arquitectura propuesta del proyecto; los componentes ejecutados de P1 se describen en las secciones 3.1 y 4.4.2.</w:t>
       </w:r>
     </w:p>
     <w:p>
@@ -20531,7 +20500,7 @@
           <w:b w:val="0"/>
           <w:rtl w:val="0"/>
         </w:rPr>
-        <w:t>La verificación previa del equipo aprobó 28 pruebas. Tras incorporar P1, la ejecución local en Windows con Python 3.12.14 aprobó 53 pruebas (pytest) y ruff check . sin errores. Se conservan las pruebas y el código de P3. Las pruebas nuevas comprueban ingesta, hashes, meses completos, rezagos exactos, ausencia de información del día pronosticado, selección por validación y métricas y artefactos de MLflow. El notebook P1 se ejecutó con siete celdas sin errores.</w:t>
+        <w:t>La verificación previa del equipo aprobó 28 pruebas. Tras incorporar P1, la ejecución local en Windows con Python 3.12.14 aprobó 60 pruebas (pytest) y ruff check . sin errores. Se conservan las pruebas y el código de P3. Las pruebas nuevas comprueban ingesta, hashes, meses completos, rezagos exactos, ausencia de información del día pronosticado, selección por validación y métricas y artefactos de MLflow. El notebook P1 se ejecutó con siete celdas sin errores. Un clon y entorno nuevos reprodujeron la ingesta con idéntica versión de datos, las cuatro filas de métricas y las 60 pruebas. También se rechazan horizontes distintos de 24 h y emisiones distintas de medianoche antes de leer datos o abrir runs.</w:t>
       </w:r>
     </w:p>
     <w:p>
@@ -20897,7 +20866,7 @@
           <w:b w:val="0"/>
           <w:rtl w:val="0"/>
         </w:rPr>
-        <w:t>P1 y sus procesos previos se ejecutaron localmente el 18 de octubre de 2026. El trabajo permanece sin commit ni push, por solicitud de Saúl. La siguiente tabla distingue los avances de P1 de los pendientes del equipo.</w:t>
+        <w:t>P1 y sus procesos previos se ejecutaron el 18 de octubre de 2026 desde un commit confirmado. La contribución se integra mediante Pull Request desde Saul. La siguiente tabla distingue los avances de P1 de los pendientes del equipo; no implica aprobación ni fusión del PR.</w:t>
       </w:r>
     </w:p>
     <w:tbl>
@@ -21172,7 +21141,7 @@
                 <w:szCs w:val="17"/>
                 <w:rtl w:val="0"/>
               </w:rPr>
-              <w:t>Flujo en README. Saúl aún debe publicar su contribución mediante PR y revisar el trabajo de otro integrante.</w:t>
+              <w:t>Flujo en README. Saúl presenta P1 mediante PR; falta la revisión del equipo y revisar el trabajo de otro integrante.</w:t>
             </w:r>
           </w:p>
         </w:tc>
@@ -21400,21 +21369,7 @@
           <w:highlight w:val="yellow"/>
           <w:rtl w:val="0"/>
         </w:rPr>
-        <w:t>[PENDIENTE: completar el usuario de GitHub de Daniel Ruán y verificar accesos de los integrantes para el paso 9. El usuario de Saúl aparece en la portada.]</w:t>
-      </w:r>
-    </w:p>
-    <w:p>
-      <w:pPr>
-        <w:rPr/>
-      </w:pPr>
-      <w:r>
-        <w:rPr>
-          <w:b w:val="0"/>
-          <w:bCs w:val="1"/>
-          <w:highlight w:val="yellow"/>
-          <w:rtl w:val="0"/>
-        </w:rPr>
-        <w:t>[PENDIENTE: matrícula de Daniel Ruán y confirmación con el profesor sobre la regla de tres o cuatro integrantes.]</w:t>
+        <w:t>[PENDIENTE: matrícula y usuario de GitHub de Daniel; accesos del equipo; confirmar con el profesor la regla de tres o cuatro integrantes.]</w:t>
       </w:r>
     </w:p>
     <w:p>

</xml_diff>